<commit_message>
Model I: tail-risk diagnostics in expected form, top-bracket share and AUC (C4); change log v2
- tail_risk_expected(): expected big-mistake, top-bin underprediction and flip
  rates under the imputation draw; top-bracket share true vs expected;
  P(top | top), P(top | not top); AUC top vs rest (auc_binary)
- Argmax tail metrics kept, labelled as thesis definition
- docs: C4 section, discussion of whether C1 meets the thesis aim of the
  class weights, proposed update of the section 4.5 selection rule

Co-Authored-By: Claude Opus 5.5 <noreply@anthropic.com>
Claude-Session: https://claude.ai/code/session_012QhShSzHzdjiZMEP8ncUaj
</commit_message>
<xml_diff>
--- a/docs/Changes_vs_thesis.docx
+++ b/docs/Changes_vs_thesis.docx
@@ -58,7 +58,7 @@
           <w:sz w:val="19"/>
           <w:szCs w:val="19"/>
         </w:rPr>
-        <w:t xml:space="preserve">Change log version 1 — 25 October 2026</w:t>
+        <w:t xml:space="preserve">Change log version 2 — 28 October 2026</w:t>
       </w:r>
     </w:p>
     <w:p>
@@ -731,6 +731,156 @@
           </w:p>
         </w:tc>
       </w:tr>
+      <w:tr>
+        <w:trPr>
+          <w:tblHeader w:val="off"/>
+        </w:trPr>
+        <w:tc>
+          <w:tcPr>
+            <w:tcW w:type="dxa" w:w="700"/>
+            <w:tcBorders>
+              <w:top w:val="single" w:color="B7B7B7" w:sz="4"/>
+              <w:left w:val="single" w:color="B7B7B7" w:sz="4"/>
+              <w:bottom w:val="single" w:color="B7B7B7" w:sz="4"/>
+              <w:right w:val="single" w:color="B7B7B7" w:sz="4"/>
+            </w:tcBorders>
+            <w:tcMar>
+              <w:top w:type="dxa" w:w="60"/>
+              <w:left w:type="dxa" w:w="100"/>
+              <w:bottom w:type="dxa" w:w="60"/>
+              <w:right w:type="dxa" w:w="100"/>
+            </w:tcMar>
+          </w:tcPr>
+          <w:p>
+            <w:r>
+              <w:rPr>
+                <w:rFonts w:ascii="Calibri" w:cs="Calibri" w:eastAsia="Calibri" w:hAnsi="Calibri"/>
+                <w:b w:val="false"/>
+                <w:bCs w:val="false"/>
+                <w:sz w:val="19"/>
+                <w:szCs w:val="19"/>
+              </w:rPr>
+              <w:t xml:space="preserve">C4</w:t>
+            </w:r>
+          </w:p>
+        </w:tc>
+        <w:tc>
+          <w:tcPr>
+            <w:tcW w:type="dxa" w:w="2700"/>
+            <w:tcBorders>
+              <w:top w:val="single" w:color="B7B7B7" w:sz="4"/>
+              <w:left w:val="single" w:color="B7B7B7" w:sz="4"/>
+              <w:bottom w:val="single" w:color="B7B7B7" w:sz="4"/>
+              <w:right w:val="single" w:color="B7B7B7" w:sz="4"/>
+            </w:tcBorders>
+            <w:tcMar>
+              <w:top w:type="dxa" w:w="60"/>
+              <w:left w:type="dxa" w:w="100"/>
+              <w:bottom w:type="dxa" w:w="60"/>
+              <w:right w:type="dxa" w:w="100"/>
+            </w:tcMar>
+          </w:tcPr>
+          <w:p>
+            <w:r>
+              <w:rPr>
+                <w:rFonts w:ascii="Calibri" w:cs="Calibri" w:eastAsia="Calibri" w:hAnsi="Calibri"/>
+                <w:b w:val="false"/>
+                <w:bCs w:val="false"/>
+                <w:sz w:val="19"/>
+                <w:szCs w:val="19"/>
+              </w:rPr>
+              <w:t xml:space="preserve">Tail-risk diagnostics in expected (probability) form, plus top-bracket share and discrimination (AUC); guardrail of the selection rule redefined accordingly</w:t>
+            </w:r>
+          </w:p>
+        </w:tc>
+        <w:tc>
+          <w:tcPr>
+            <w:tcW w:type="dxa" w:w="1500"/>
+            <w:tcBorders>
+              <w:top w:val="single" w:color="B7B7B7" w:sz="4"/>
+              <w:left w:val="single" w:color="B7B7B7" w:sz="4"/>
+              <w:bottom w:val="single" w:color="B7B7B7" w:sz="4"/>
+              <w:right w:val="single" w:color="B7B7B7" w:sz="4"/>
+            </w:tcBorders>
+            <w:tcMar>
+              <w:top w:type="dxa" w:w="60"/>
+              <w:left w:type="dxa" w:w="100"/>
+              <w:bottom w:type="dxa" w:w="60"/>
+              <w:right w:type="dxa" w:w="100"/>
+            </w:tcMar>
+          </w:tcPr>
+          <w:p>
+            <w:r>
+              <w:rPr>
+                <w:rFonts w:ascii="Calibri" w:cs="Calibri" w:eastAsia="Calibri" w:hAnsi="Calibri"/>
+                <w:b w:val="false"/>
+                <w:bCs w:val="false"/>
+                <w:sz w:val="19"/>
+                <w:szCs w:val="19"/>
+              </w:rPr>
+              <w:t xml:space="preserve">§4.3.1, Table 9, §4.5</w:t>
+            </w:r>
+          </w:p>
+        </w:tc>
+        <w:tc>
+          <w:tcPr>
+            <w:tcW w:type="dxa" w:w="2200"/>
+            <w:tcBorders>
+              <w:top w:val="single" w:color="B7B7B7" w:sz="4"/>
+              <w:left w:val="single" w:color="B7B7B7" w:sz="4"/>
+              <w:bottom w:val="single" w:color="B7B7B7" w:sz="4"/>
+              <w:right w:val="single" w:color="B7B7B7" w:sz="4"/>
+            </w:tcBorders>
+            <w:tcMar>
+              <w:top w:type="dxa" w:w="60"/>
+              <w:left w:type="dxa" w:w="100"/>
+              <w:bottom w:type="dxa" w:w="60"/>
+              <w:right w:type="dxa" w:w="100"/>
+            </w:tcMar>
+          </w:tcPr>
+          <w:p>
+            <w:r>
+              <w:rPr>
+                <w:rFonts w:ascii="Calibri" w:cs="Calibri" w:eastAsia="Calibri" w:hAnsi="Calibri"/>
+                <w:b w:val="false"/>
+                <w:bCs w:val="false"/>
+                <w:sz w:val="19"/>
+                <w:szCs w:val="19"/>
+              </w:rPr>
+              <w:t xml:space="preserve">Model I — Blocks 1, 8, 11</w:t>
+            </w:r>
+          </w:p>
+        </w:tc>
+        <w:tc>
+          <w:tcPr>
+            <w:tcW w:type="dxa" w:w="1926"/>
+            <w:tcBorders>
+              <w:top w:val="single" w:color="B7B7B7" w:sz="4"/>
+              <w:left w:val="single" w:color="B7B7B7" w:sz="4"/>
+              <w:bottom w:val="single" w:color="B7B7B7" w:sz="4"/>
+              <w:right w:val="single" w:color="B7B7B7" w:sz="4"/>
+            </w:tcBorders>
+            <w:tcMar>
+              <w:top w:type="dxa" w:w="60"/>
+              <w:left w:type="dxa" w:w="100"/>
+              <w:bottom w:type="dxa" w:w="60"/>
+              <w:right w:type="dxa" w:w="100"/>
+            </w:tcMar>
+          </w:tcPr>
+          <w:p>
+            <w:r>
+              <w:rPr>
+                <w:rFonts w:ascii="Calibri" w:cs="Calibri" w:eastAsia="Calibri" w:hAnsi="Calibri"/>
+                <w:b w:val="false"/>
+                <w:bCs w:val="false"/>
+                <w:sz w:val="19"/>
+                <w:szCs w:val="19"/>
+              </w:rPr>
+              <w:t xml:space="preserve">Adds rows to Table 9; changes the TBU guardrail of the selection rule</w:t>
+            </w:r>
+          </w:p>
+        </w:tc>
+      </w:tr>
     </w:tbl>
     <w:p>
       <w:pPr>
@@ -753,7 +903,7 @@
         <w:rPr>
           <w:rFonts w:ascii="Calibri" w:cs="Calibri" w:eastAsia="Calibri" w:hAnsi="Calibri"/>
         </w:rPr>
-        <w:t xml:space="preserve">code changes implemented and tested on synthetic data (formulas checked by hand). The pipeline has not yet been re-run on the SAFE microdata, so the new numbers for Tables 9–11 are pending. Model II is unchanged.</w:t>
+        <w:t xml:space="preserve">code changes implemented and tested on synthetic data (formulas checked by hand; C4 metrics checked against Monte Carlo draws). The pipeline has not yet been re-run on the SAFE microdata, so the new numbers for Tables 9–11 are pending. Model II is unchanged.</w:t>
       </w:r>
     </w:p>
     <w:p>
@@ -976,7 +1126,78 @@
         <w:rPr>
           <w:rFonts w:ascii="Calibri" w:cs="Calibri" w:eastAsia="Calibri" w:hAnsi="Calibri"/>
         </w:rPr>
-        <w:t xml:space="preserve">Under "none" or "corrected", the imputed brackets, the euro-space metrics (which use the probability-weighted expected midpoint) and the financing-gap aggregates all change. The expected direction is fewer top-bracket imputations and therefore lower euro gaps, especially in the fully imputed waves after 2022. Individual-level metrics computed on argmax labels (accuracy, QWK, macro F1, tail-risk rates) may get worse under "none", because without weights the argmax rarely selects small brackets; this is expected and is not a problem for the estimand (see C2).</w:t>
+        <w:t xml:space="preserve">Under "none" or "corrected", the imputed brackets, the euro-space metrics (which use the probability-weighted expected midpoint) and the financing-gap aggregates all change. The expected direction is fewer top-bracket imputations and therefore lower euro gaps, especially in the fully imputed waves after 2022. Individual-level metrics computed on argmax labels (accuracy, QWK, macro F1, tail-risk rates) may get worse under "none", because without weights the argmax rarely selects small brackets; this is expected and is not a problem for the estimand (see C2 and C4).</w:t>
+      </w:r>
+    </w:p>
+    <w:p>
+      <w:pPr>
+        <w:pStyle w:val="Heading3"/>
+        <w:spacing w:after="80" w:before="160"/>
+      </w:pPr>
+      <w:r>
+        <w:rPr>
+          <w:rFonts w:ascii="Calibri" w:cs="Calibri" w:eastAsia="Calibri" w:hAnsi="Calibri"/>
+        </w:rPr>
+        <w:t xml:space="preserve">Does this still meet the purpose the thesis gave to the weights?</w:t>
+      </w:r>
+    </w:p>
+    <w:p>
+      <w:pPr>
+        <w:spacing w:after="120" w:line="276"/>
+      </w:pPr>
+      <w:r>
+        <w:rPr>
+          <w:rFonts w:ascii="Calibri" w:cs="Calibri" w:eastAsia="Calibri" w:hAnsi="Calibri"/>
+        </w:rPr>
+        <w:t xml:space="preserve">The thesis motivated the weights with two aims (§3.2.2): (i) avoid over-allocating firms to the modal bracket, so that the tails do not disappear from the imputed data; (ii) improve performance in the tails, above all the top bracket, which carries most of the euro value.</w:t>
+      </w:r>
+    </w:p>
+    <w:p>
+      <w:pPr>
+        <w:pStyle w:val="ListParagraph"/>
+        <w:numPr>
+          <w:ilvl w:val="0"/>
+          <w:numId w:val="2"/>
+        </w:numPr>
+        <w:spacing w:after="80" w:line="276"/>
+      </w:pPr>
+      <w:r>
+        <w:rPr>
+          <w:rFonts w:ascii="Calibri" w:cs="Calibri" w:eastAsia="Calibri" w:hAnsi="Calibri"/>
+          <w:b/>
+          <w:bCs/>
+        </w:rPr>
+        <w:t xml:space="preserve">Aim (i) is met without weights. </w:t>
+      </w:r>
+      <w:r>
+        <w:rPr>
+          <w:rFonts w:ascii="Calibri" w:cs="Calibri" w:eastAsia="Calibri" w:hAnsi="Calibri"/>
+        </w:rPr>
+        <w:t xml:space="preserve">Over-allocation to the modal bracket is a property of argmax assignment. The thesis already imputes by a random draw, precisely because the draw “preserves cross-sectional dispersion” (§3.2.2). With calibrated probabilities the draw reproduces each bracket share, tails included. Weights and draw were two remedies for the same problem; used together they over-corrected it.</w:t>
+      </w:r>
+    </w:p>
+    <w:p>
+      <w:pPr>
+        <w:pStyle w:val="ListParagraph"/>
+        <w:numPr>
+          <w:ilvl w:val="0"/>
+          <w:numId w:val="2"/>
+        </w:numPr>
+        <w:spacing w:after="80" w:line="276"/>
+      </w:pPr>
+      <w:r>
+        <w:rPr>
+          <w:rFonts w:ascii="Calibri" w:cs="Calibri" w:eastAsia="Calibri" w:hAnsi="Calibri"/>
+          <w:b/>
+          <w:bCs/>
+        </w:rPr>
+        <w:t xml:space="preserve">Aim (ii) is where the two settings differ. </w:t>
+      </w:r>
+      <w:r>
+        <w:rPr>
+          <w:rFonts w:ascii="Calibri" w:cs="Calibri" w:eastAsia="Calibri" w:hAnsi="Calibri"/>
+        </w:rPr>
+        <w:t xml:space="preserve">Weights also change what the trees learn: top-bracket observations count more, so the model may become better at recognising which firms are in the top bracket. "none" gives up this emphasis; "corrected" keeps it in training and then restores calibrated probabilities. Because the prior-shift correction is exact only for a well-specified model, which setting is better is an empirical question, settled on the holdout with the metrics of C4.</w:t>
       </w:r>
     </w:p>
     <w:p>
@@ -2411,7 +2632,564 @@
         <w:rPr>
           <w:rFonts w:ascii="Calibri" w:cs="Calibri" w:eastAsia="Calibri" w:hAnsi="Calibri"/>
         </w:rPr>
-        <w:t xml:space="preserve">6. What has not changed</w:t>
+        <w:t xml:space="preserve">6. Change C4 — Tail-risk diagnostics consistent with the draw</w:t>
+      </w:r>
+    </w:p>
+    <w:p>
+      <w:pPr>
+        <w:pStyle w:val="Heading3"/>
+        <w:spacing w:after="80" w:before="160"/>
+      </w:pPr>
+      <w:r>
+        <w:rPr>
+          <w:rFonts w:ascii="Calibri" w:cs="Calibri" w:eastAsia="Calibri" w:hAnsi="Calibri"/>
+        </w:rPr>
+        <w:t xml:space="preserve">What the thesis did</w:t>
+      </w:r>
+    </w:p>
+    <w:p>
+      <w:pPr>
+        <w:spacing w:after="120" w:line="276"/>
+      </w:pPr>
+      <w:r>
+        <w:rPr>
+          <w:rFonts w:ascii="Calibri" w:cs="Calibri" w:eastAsia="Calibri" w:hAnsi="Calibri"/>
+        </w:rPr>
+        <w:t xml:space="preserve">The tail-risk block of Table 9 (big-mistake rate, top-bin underprediction rate TBU, catastrophic flip rate) was computed on argmax labels. TBU also enters the model selection rule of §4.5 as a guardrail (TBU_m ≤ TBU* + δ_T).</w:t>
+      </w:r>
+    </w:p>
+    <w:p>
+      <w:pPr>
+        <w:pStyle w:val="Heading3"/>
+        <w:spacing w:after="80" w:before="160"/>
+      </w:pPr>
+      <w:r>
+        <w:rPr>
+          <w:rFonts w:ascii="Calibri" w:cs="Calibri" w:eastAsia="Calibri" w:hAnsi="Calibri"/>
+        </w:rPr>
+        <w:t xml:space="preserve">Why this is a problem</w:t>
+      </w:r>
+    </w:p>
+    <w:p>
+      <w:pPr>
+        <w:spacing w:after="120" w:line="276"/>
+      </w:pPr>
+      <w:r>
+        <w:rPr>
+          <w:rFonts w:ascii="Calibri" w:cs="Calibri" w:eastAsia="Calibri" w:hAnsi="Calibri"/>
+        </w:rPr>
+        <w:t xml:space="preserve">As with TVD (C2), argmax metrics do not describe the imputed data, which is produced by a random draw. TBU is the clearest case: without class weights the argmax almost never picks the top bracket (its probability is rarely the largest), so argmax-TBU approaches 1 even when the model reproduces the top-bracket share exactly. Keeping the argmax TBU as a guardrail would mechanically reject the calibrated model, for a reason that does not affect the dataset.</w:t>
+      </w:r>
+    </w:p>
+    <w:p>
+      <w:pPr>
+        <w:pStyle w:val="Heading3"/>
+        <w:spacing w:after="80" w:before="160"/>
+      </w:pPr>
+      <w:r>
+        <w:rPr>
+          <w:rFonts w:ascii="Calibri" w:cs="Calibri" w:eastAsia="Calibri" w:hAnsi="Calibri"/>
+        </w:rPr>
+        <w:t xml:space="preserve">What the code does now</w:t>
+      </w:r>
+    </w:p>
+    <w:p>
+      <w:pPr>
+        <w:spacing w:after="120" w:line="276"/>
+      </w:pPr>
+      <w:r>
+        <w:rPr>
+          <w:rFonts w:ascii="Calibri" w:cs="Calibri" w:eastAsia="Calibri" w:hAnsi="Calibri"/>
+        </w:rPr>
+        <w:t xml:space="preserve">Each tail metric is replaced by its expectation under the draw Y_i* ~ Categorical(p̂_i), where k_i is firm i’s observed bracket and K the top bracket:</w:t>
+      </w:r>
+    </w:p>
+    <w:tbl>
+      <w:tblPr>
+        <w:tblW w:type="dxa" w:w="9026"/>
+        <w:tblBorders>
+          <w:top w:val="single" w:color="auto" w:sz="4"/>
+          <w:left w:val="single" w:color="auto" w:sz="4"/>
+          <w:bottom w:val="single" w:color="auto" w:sz="4"/>
+          <w:right w:val="single" w:color="auto" w:sz="4"/>
+          <w:insideH w:val="single" w:color="auto" w:sz="4"/>
+          <w:insideV w:val="single" w:color="auto" w:sz="4"/>
+        </w:tblBorders>
+      </w:tblPr>
+      <w:tblGrid>
+        <w:gridCol w:w="3000"/>
+        <w:gridCol w:w="6026"/>
+      </w:tblGrid>
+      <w:tr>
+        <w:trPr>
+          <w:tblHeader/>
+        </w:trPr>
+        <w:tc>
+          <w:tcPr>
+            <w:tcW w:type="dxa" w:w="3000"/>
+            <w:tcBorders>
+              <w:top w:val="single" w:color="B7B7B7" w:sz="4"/>
+              <w:left w:val="single" w:color="B7B7B7" w:sz="4"/>
+              <w:bottom w:val="single" w:color="B7B7B7" w:sz="4"/>
+              <w:right w:val="single" w:color="B7B7B7" w:sz="4"/>
+            </w:tcBorders>
+            <w:shd w:fill="DCE6F0" w:val="clear"/>
+            <w:tcMar>
+              <w:top w:type="dxa" w:w="60"/>
+              <w:left w:type="dxa" w:w="100"/>
+              <w:bottom w:type="dxa" w:w="60"/>
+              <w:right w:type="dxa" w:w="100"/>
+            </w:tcMar>
+          </w:tcPr>
+          <w:p>
+            <w:r>
+              <w:rPr>
+                <w:rFonts w:ascii="Calibri" w:cs="Calibri" w:eastAsia="Calibri" w:hAnsi="Calibri"/>
+                <w:b/>
+                <w:bCs/>
+                <w:sz w:val="19"/>
+                <w:szCs w:val="19"/>
+              </w:rPr>
+              <w:t xml:space="preserve">Metric</w:t>
+            </w:r>
+          </w:p>
+        </w:tc>
+        <w:tc>
+          <w:tcPr>
+            <w:tcW w:type="dxa" w:w="6026"/>
+            <w:tcBorders>
+              <w:top w:val="single" w:color="B7B7B7" w:sz="4"/>
+              <w:left w:val="single" w:color="B7B7B7" w:sz="4"/>
+              <w:bottom w:val="single" w:color="B7B7B7" w:sz="4"/>
+              <w:right w:val="single" w:color="B7B7B7" w:sz="4"/>
+            </w:tcBorders>
+            <w:shd w:fill="DCE6F0" w:val="clear"/>
+            <w:tcMar>
+              <w:top w:type="dxa" w:w="60"/>
+              <w:left w:type="dxa" w:w="100"/>
+              <w:bottom w:type="dxa" w:w="60"/>
+              <w:right w:type="dxa" w:w="100"/>
+            </w:tcMar>
+          </w:tcPr>
+          <w:p>
+            <w:r>
+              <w:rPr>
+                <w:rFonts w:ascii="Calibri" w:cs="Calibri" w:eastAsia="Calibri" w:hAnsi="Calibri"/>
+                <w:b/>
+                <w:bCs/>
+                <w:sz w:val="19"/>
+                <w:szCs w:val="19"/>
+              </w:rPr>
+              <w:t xml:space="preserve">Definition</w:t>
+            </w:r>
+          </w:p>
+        </w:tc>
+      </w:tr>
+      <w:tr>
+        <w:trPr>
+          <w:tblHeader w:val="off"/>
+        </w:trPr>
+        <w:tc>
+          <w:tcPr>
+            <w:tcW w:type="dxa" w:w="3000"/>
+            <w:tcBorders>
+              <w:top w:val="single" w:color="B7B7B7" w:sz="4"/>
+              <w:left w:val="single" w:color="B7B7B7" w:sz="4"/>
+              <w:bottom w:val="single" w:color="B7B7B7" w:sz="4"/>
+              <w:right w:val="single" w:color="B7B7B7" w:sz="4"/>
+            </w:tcBorders>
+            <w:tcMar>
+              <w:top w:type="dxa" w:w="60"/>
+              <w:left w:type="dxa" w:w="100"/>
+              <w:bottom w:type="dxa" w:w="60"/>
+              <w:right w:type="dxa" w:w="100"/>
+            </w:tcMar>
+          </w:tcPr>
+          <w:p>
+            <w:r>
+              <w:rPr>
+                <w:rFonts w:ascii="Calibri" w:cs="Calibri" w:eastAsia="Calibri" w:hAnsi="Calibri"/>
+                <w:b w:val="false"/>
+                <w:bCs w:val="false"/>
+                <w:sz w:val="19"/>
+                <w:szCs w:val="19"/>
+              </w:rPr>
+              <w:t xml:space="preserve">E[big mistake rate]</w:t>
+            </w:r>
+          </w:p>
+        </w:tc>
+        <w:tc>
+          <w:tcPr>
+            <w:tcW w:type="dxa" w:w="6026"/>
+            <w:tcBorders>
+              <w:top w:val="single" w:color="B7B7B7" w:sz="4"/>
+              <w:left w:val="single" w:color="B7B7B7" w:sz="4"/>
+              <w:bottom w:val="single" w:color="B7B7B7" w:sz="4"/>
+              <w:right w:val="single" w:color="B7B7B7" w:sz="4"/>
+            </w:tcBorders>
+            <w:tcMar>
+              <w:top w:type="dxa" w:w="60"/>
+              <w:left w:type="dxa" w:w="100"/>
+              <w:bottom w:type="dxa" w:w="60"/>
+              <w:right w:type="dxa" w:w="100"/>
+            </w:tcMar>
+          </w:tcPr>
+          <w:p>
+            <w:r>
+              <w:rPr>
+                <w:rFonts w:ascii="Calibri" w:cs="Calibri" w:eastAsia="Calibri" w:hAnsi="Calibri"/>
+                <w:b w:val="false"/>
+                <w:bCs w:val="false"/>
+                <w:sz w:val="19"/>
+                <w:szCs w:val="19"/>
+              </w:rPr>
+              <w:t xml:space="preserve">mean_i Σ_{k: |k − k_i| ≥ 2} p̂_ik — expected share of firms imputed two or more brackets away</w:t>
+            </w:r>
+          </w:p>
+        </w:tc>
+      </w:tr>
+      <w:tr>
+        <w:trPr>
+          <w:tblHeader w:val="off"/>
+        </w:trPr>
+        <w:tc>
+          <w:tcPr>
+            <w:tcW w:type="dxa" w:w="3000"/>
+            <w:tcBorders>
+              <w:top w:val="single" w:color="B7B7B7" w:sz="4"/>
+              <w:left w:val="single" w:color="B7B7B7" w:sz="4"/>
+              <w:bottom w:val="single" w:color="B7B7B7" w:sz="4"/>
+              <w:right w:val="single" w:color="B7B7B7" w:sz="4"/>
+            </w:tcBorders>
+            <w:tcMar>
+              <w:top w:type="dxa" w:w="60"/>
+              <w:left w:type="dxa" w:w="100"/>
+              <w:bottom w:type="dxa" w:w="60"/>
+              <w:right w:type="dxa" w:w="100"/>
+            </w:tcMar>
+          </w:tcPr>
+          <w:p>
+            <w:r>
+              <w:rPr>
+                <w:rFonts w:ascii="Calibri" w:cs="Calibri" w:eastAsia="Calibri" w:hAnsi="Calibri"/>
+                <w:b w:val="false"/>
+                <w:bCs w:val="false"/>
+                <w:sz w:val="19"/>
+                <w:szCs w:val="19"/>
+              </w:rPr>
+              <w:t xml:space="preserve">E[top-bin underprediction]</w:t>
+            </w:r>
+          </w:p>
+        </w:tc>
+        <w:tc>
+          <w:tcPr>
+            <w:tcW w:type="dxa" w:w="6026"/>
+            <w:tcBorders>
+              <w:top w:val="single" w:color="B7B7B7" w:sz="4"/>
+              <w:left w:val="single" w:color="B7B7B7" w:sz="4"/>
+              <w:bottom w:val="single" w:color="B7B7B7" w:sz="4"/>
+              <w:right w:val="single" w:color="B7B7B7" w:sz="4"/>
+            </w:tcBorders>
+            <w:tcMar>
+              <w:top w:type="dxa" w:w="60"/>
+              <w:left w:type="dxa" w:w="100"/>
+              <w:bottom w:type="dxa" w:w="60"/>
+              <w:right w:type="dxa" w:w="100"/>
+            </w:tcMar>
+          </w:tcPr>
+          <w:p>
+            <w:r>
+              <w:rPr>
+                <w:rFonts w:ascii="Calibri" w:cs="Calibri" w:eastAsia="Calibri" w:hAnsi="Calibri"/>
+                <w:b w:val="false"/>
+                <w:bCs w:val="false"/>
+                <w:sz w:val="19"/>
+                <w:szCs w:val="19"/>
+              </w:rPr>
+              <w:t xml:space="preserve">mean over true-top firms of (1 − p̂_iK) — expected share of top-bracket firms imputed below the top</w:t>
+            </w:r>
+          </w:p>
+        </w:tc>
+      </w:tr>
+      <w:tr>
+        <w:trPr>
+          <w:tblHeader w:val="off"/>
+        </w:trPr>
+        <w:tc>
+          <w:tcPr>
+            <w:tcW w:type="dxa" w:w="3000"/>
+            <w:tcBorders>
+              <w:top w:val="single" w:color="B7B7B7" w:sz="4"/>
+              <w:left w:val="single" w:color="B7B7B7" w:sz="4"/>
+              <w:bottom w:val="single" w:color="B7B7B7" w:sz="4"/>
+              <w:right w:val="single" w:color="B7B7B7" w:sz="4"/>
+            </w:tcBorders>
+            <w:tcMar>
+              <w:top w:type="dxa" w:w="60"/>
+              <w:left w:type="dxa" w:w="100"/>
+              <w:bottom w:type="dxa" w:w="60"/>
+              <w:right w:type="dxa" w:w="100"/>
+            </w:tcMar>
+          </w:tcPr>
+          <w:p>
+            <w:r>
+              <w:rPr>
+                <w:rFonts w:ascii="Calibri" w:cs="Calibri" w:eastAsia="Calibri" w:hAnsi="Calibri"/>
+                <w:b w:val="false"/>
+                <w:bCs w:val="false"/>
+                <w:sz w:val="19"/>
+                <w:szCs w:val="19"/>
+              </w:rPr>
+              <w:t xml:space="preserve">E[catastrophic flip rate]</w:t>
+            </w:r>
+          </w:p>
+        </w:tc>
+        <w:tc>
+          <w:tcPr>
+            <w:tcW w:type="dxa" w:w="6026"/>
+            <w:tcBorders>
+              <w:top w:val="single" w:color="B7B7B7" w:sz="4"/>
+              <w:left w:val="single" w:color="B7B7B7" w:sz="4"/>
+              <w:bottom w:val="single" w:color="B7B7B7" w:sz="4"/>
+              <w:right w:val="single" w:color="B7B7B7" w:sz="4"/>
+            </w:tcBorders>
+            <w:tcMar>
+              <w:top w:type="dxa" w:w="60"/>
+              <w:left w:type="dxa" w:w="100"/>
+              <w:bottom w:type="dxa" w:w="60"/>
+              <w:right w:type="dxa" w:w="100"/>
+            </w:tcMar>
+          </w:tcPr>
+          <w:p>
+            <w:r>
+              <w:rPr>
+                <w:rFonts w:ascii="Calibri" w:cs="Calibri" w:eastAsia="Calibri" w:hAnsi="Calibri"/>
+                <w:b w:val="false"/>
+                <w:bCs w:val="false"/>
+                <w:sz w:val="19"/>
+                <w:szCs w:val="19"/>
+              </w:rPr>
+              <w:t xml:space="preserve">mean_i [ 1{k_i = 1} p̂_iK + 1{k_i = K} p̂_i1 ]</w:t>
+            </w:r>
+          </w:p>
+        </w:tc>
+      </w:tr>
+      <w:tr>
+        <w:trPr>
+          <w:tblHeader w:val="off"/>
+        </w:trPr>
+        <w:tc>
+          <w:tcPr>
+            <w:tcW w:type="dxa" w:w="3000"/>
+            <w:tcBorders>
+              <w:top w:val="single" w:color="B7B7B7" w:sz="4"/>
+              <w:left w:val="single" w:color="B7B7B7" w:sz="4"/>
+              <w:bottom w:val="single" w:color="B7B7B7" w:sz="4"/>
+              <w:right w:val="single" w:color="B7B7B7" w:sz="4"/>
+            </w:tcBorders>
+            <w:tcMar>
+              <w:top w:type="dxa" w:w="60"/>
+              <w:left w:type="dxa" w:w="100"/>
+              <w:bottom w:type="dxa" w:w="60"/>
+              <w:right w:type="dxa" w:w="100"/>
+            </w:tcMar>
+          </w:tcPr>
+          <w:p>
+            <w:r>
+              <w:rPr>
+                <w:rFonts w:ascii="Calibri" w:cs="Calibri" w:eastAsia="Calibri" w:hAnsi="Calibri"/>
+                <w:b w:val="false"/>
+                <w:bCs w:val="false"/>
+                <w:sz w:val="19"/>
+                <w:szCs w:val="19"/>
+              </w:rPr>
+              <w:t xml:space="preserve">Top-bracket share (true / expected / ratio)</w:t>
+            </w:r>
+          </w:p>
+        </w:tc>
+        <w:tc>
+          <w:tcPr>
+            <w:tcW w:type="dxa" w:w="6026"/>
+            <w:tcBorders>
+              <w:top w:val="single" w:color="B7B7B7" w:sz="4"/>
+              <w:left w:val="single" w:color="B7B7B7" w:sz="4"/>
+              <w:bottom w:val="single" w:color="B7B7B7" w:sz="4"/>
+              <w:right w:val="single" w:color="B7B7B7" w:sz="4"/>
+            </w:tcBorders>
+            <w:tcMar>
+              <w:top w:type="dxa" w:w="60"/>
+              <w:left w:type="dxa" w:w="100"/>
+              <w:bottom w:type="dxa" w:w="60"/>
+              <w:right w:type="dxa" w:w="100"/>
+            </w:tcMar>
+          </w:tcPr>
+          <w:p>
+            <w:r>
+              <w:rPr>
+                <w:rFonts w:ascii="Calibri" w:cs="Calibri" w:eastAsia="Calibri" w:hAnsi="Calibri"/>
+                <w:b w:val="false"/>
+                <w:bCs w:val="false"/>
+                <w:sz w:val="19"/>
+                <w:szCs w:val="19"/>
+              </w:rPr>
+              <w:t xml:space="preserve">mean_i 1{k_i = K} vs mean_i p̂_iK. Ratio &gt; 1: the draw over-allocates to the EUR 1.5m bracket (euro gap biased up); &lt; 1: under-allocates.</w:t>
+            </w:r>
+          </w:p>
+        </w:tc>
+      </w:tr>
+      <w:tr>
+        <w:trPr>
+          <w:tblHeader w:val="off"/>
+        </w:trPr>
+        <w:tc>
+          <w:tcPr>
+            <w:tcW w:type="dxa" w:w="3000"/>
+            <w:tcBorders>
+              <w:top w:val="single" w:color="B7B7B7" w:sz="4"/>
+              <w:left w:val="single" w:color="B7B7B7" w:sz="4"/>
+              <w:bottom w:val="single" w:color="B7B7B7" w:sz="4"/>
+              <w:right w:val="single" w:color="B7B7B7" w:sz="4"/>
+            </w:tcBorders>
+            <w:tcMar>
+              <w:top w:type="dxa" w:w="60"/>
+              <w:left w:type="dxa" w:w="100"/>
+              <w:bottom w:type="dxa" w:w="60"/>
+              <w:right w:type="dxa" w:w="100"/>
+            </w:tcMar>
+          </w:tcPr>
+          <w:p>
+            <w:r>
+              <w:rPr>
+                <w:rFonts w:ascii="Calibri" w:cs="Calibri" w:eastAsia="Calibri" w:hAnsi="Calibri"/>
+                <w:b w:val="false"/>
+                <w:bCs w:val="false"/>
+                <w:sz w:val="19"/>
+                <w:szCs w:val="19"/>
+              </w:rPr>
+              <w:t xml:space="preserve">P(top | true top), P(top | true not top)</w:t>
+            </w:r>
+          </w:p>
+        </w:tc>
+        <w:tc>
+          <w:tcPr>
+            <w:tcW w:type="dxa" w:w="6026"/>
+            <w:tcBorders>
+              <w:top w:val="single" w:color="B7B7B7" w:sz="4"/>
+              <w:left w:val="single" w:color="B7B7B7" w:sz="4"/>
+              <w:bottom w:val="single" w:color="B7B7B7" w:sz="4"/>
+              <w:right w:val="single" w:color="B7B7B7" w:sz="4"/>
+            </w:tcBorders>
+            <w:tcMar>
+              <w:top w:type="dxa" w:w="60"/>
+              <w:left w:type="dxa" w:w="100"/>
+              <w:bottom w:type="dxa" w:w="60"/>
+              <w:right w:type="dxa" w:w="100"/>
+            </w:tcMar>
+          </w:tcPr>
+          <w:p>
+            <w:r>
+              <w:rPr>
+                <w:rFonts w:ascii="Calibri" w:cs="Calibri" w:eastAsia="Calibri" w:hAnsi="Calibri"/>
+                <w:b w:val="false"/>
+                <w:bCs w:val="false"/>
+                <w:sz w:val="19"/>
+                <w:szCs w:val="19"/>
+              </w:rPr>
+              <w:t xml:space="preserve">Average top-bracket probability for firms that are / are not in the top bracket. Their gap measures how well the model separates the two groups.</w:t>
+            </w:r>
+          </w:p>
+        </w:tc>
+      </w:tr>
+      <w:tr>
+        <w:trPr>
+          <w:tblHeader w:val="off"/>
+        </w:trPr>
+        <w:tc>
+          <w:tcPr>
+            <w:tcW w:type="dxa" w:w="3000"/>
+            <w:tcBorders>
+              <w:top w:val="single" w:color="B7B7B7" w:sz="4"/>
+              <w:left w:val="single" w:color="B7B7B7" w:sz="4"/>
+              <w:bottom w:val="single" w:color="B7B7B7" w:sz="4"/>
+              <w:right w:val="single" w:color="B7B7B7" w:sz="4"/>
+            </w:tcBorders>
+            <w:tcMar>
+              <w:top w:type="dxa" w:w="60"/>
+              <w:left w:type="dxa" w:w="100"/>
+              <w:bottom w:type="dxa" w:w="60"/>
+              <w:right w:type="dxa" w:w="100"/>
+            </w:tcMar>
+          </w:tcPr>
+          <w:p>
+            <w:r>
+              <w:rPr>
+                <w:rFonts w:ascii="Calibri" w:cs="Calibri" w:eastAsia="Calibri" w:hAnsi="Calibri"/>
+                <w:b w:val="false"/>
+                <w:bCs w:val="false"/>
+                <w:sz w:val="19"/>
+                <w:szCs w:val="19"/>
+              </w:rPr>
+              <w:t xml:space="preserve">AUC top vs rest</w:t>
+            </w:r>
+          </w:p>
+        </w:tc>
+        <w:tc>
+          <w:tcPr>
+            <w:tcW w:type="dxa" w:w="6026"/>
+            <w:tcBorders>
+              <w:top w:val="single" w:color="B7B7B7" w:sz="4"/>
+              <w:left w:val="single" w:color="B7B7B7" w:sz="4"/>
+              <w:bottom w:val="single" w:color="B7B7B7" w:sz="4"/>
+              <w:right w:val="single" w:color="B7B7B7" w:sz="4"/>
+            </w:tcBorders>
+            <w:tcMar>
+              <w:top w:type="dxa" w:w="60"/>
+              <w:left w:type="dxa" w:w="100"/>
+              <w:bottom w:type="dxa" w:w="60"/>
+              <w:right w:type="dxa" w:w="100"/>
+            </w:tcMar>
+          </w:tcPr>
+          <w:p>
+            <w:r>
+              <w:rPr>
+                <w:rFonts w:ascii="Calibri" w:cs="Calibri" w:eastAsia="Calibri" w:hAnsi="Calibri"/>
+                <w:b w:val="false"/>
+                <w:bCs w:val="false"/>
+                <w:sz w:val="19"/>
+                <w:szCs w:val="19"/>
+              </w:rPr>
+              <w:t xml:space="preserve">Probability that a random top-bracket firm gets a higher p̂_iK than a random other firm (Mann–Whitney, ties = ½). 0.5 = no discrimination, 1 = perfect. Insensitive to calibration, so it isolates aim (ii) of the class weights.</w:t>
+            </w:r>
+          </w:p>
+        </w:tc>
+      </w:tr>
+    </w:tbl>
+    <w:p>
+      <w:pPr>
+        <w:spacing w:after="60"/>
+      </w:pPr>
+    </w:p>
+    <w:p>
+      <w:pPr>
+        <w:spacing w:after="120" w:line="276"/>
+      </w:pPr>
+      <w:r>
+        <w:rPr>
+          <w:rFonts w:ascii="Calibri" w:cs="Calibri" w:eastAsia="Calibri" w:hAnsi="Calibri"/>
+        </w:rPr>
+        <w:t xml:space="preserve">The expected metrics are deterministic (no seed dependence) and equal the average of the corresponding metrics computed on the drawn brackets, averaged over infinitely many draws; this was verified numerically against 400 Monte Carlo draws. The argmax versions remain in the output, labelled “thesis definition”. New functions tail_risk_expected() and auc_binary() in Block 1.</w:t>
+      </w:r>
+    </w:p>
+    <w:p>
+      <w:pPr>
+        <w:pStyle w:val="Heading3"/>
+        <w:spacing w:after="80" w:before="160"/>
+      </w:pPr>
+      <w:r>
+        <w:rPr>
+          <w:rFonts w:ascii="Calibri" w:cs="Calibri" w:eastAsia="Calibri" w:hAnsi="Calibri"/>
+        </w:rPr>
+        <w:t xml:space="preserve">How to read them when comparing "none" and "corrected"</w:t>
       </w:r>
     </w:p>
     <w:p>
@@ -2427,7 +3205,7 @@
         <w:rPr>
           <w:rFonts w:ascii="Calibri" w:cs="Calibri" w:eastAsia="Calibri" w:hAnsi="Calibri"/>
         </w:rPr>
-        <w:t xml:space="preserve">Sample construction, Q8A cleaning, predictor screening and feature set (Blocks 2–4). Open issues on these are listed in section 7.</w:t>
+        <w:t xml:space="preserve">Aggregate credibility (aim i): expected-share TVD (C2) and the top-bracket share ratio, which should be close to 1.</w:t>
       </w:r>
     </w:p>
     <w:p>
@@ -2443,7 +3221,42 @@
         <w:rPr>
           <w:rFonts w:ascii="Calibri" w:cs="Calibri" w:eastAsia="Calibri" w:hAnsi="Calibri"/>
         </w:rPr>
-        <w:t xml:space="preserve">Holdout design: last 20% of observed waves (waves 26–28).</w:t>
+        <w:t xml:space="preserve">Tail discrimination (aim ii): AUC top vs rest, and the gap between P(top | true top) and P(top | true not top). If "corrected" gives a clearly higher AUC with a comparable share ratio and TVD, the weights are earning their place; otherwise "none" is preferred as the simpler choice.</w:t>
+      </w:r>
+    </w:p>
+    <w:p>
+      <w:pPr>
+        <w:pStyle w:val="Heading3"/>
+        <w:spacing w:after="80" w:before="160"/>
+      </w:pPr>
+      <w:r>
+        <w:rPr>
+          <w:rFonts w:ascii="Calibri" w:cs="Calibri" w:eastAsia="Calibri" w:hAnsi="Calibri"/>
+        </w:rPr>
+        <w:t xml:space="preserve">Proposed update to the selection rule (thesis §4.5)</w:t>
+      </w:r>
+    </w:p>
+    <w:p>
+      <w:pPr>
+        <w:spacing w:after="120" w:line="276"/>
+      </w:pPr>
+      <w:r>
+        <w:rPr>
+          <w:rFonts w:ascii="Calibri" w:cs="Calibri" w:eastAsia="Calibri" w:hAnsi="Calibri"/>
+        </w:rPr>
+        <w:t xml:space="preserve">In the admissible set F of equation (8), the guardrail TBU_m ≤ TBU* + δ_T is evaluated with the expected TBU instead of the argmax TBU. The objective (9) uses the expected-share TVD (C2). The other guardrails (RMSE, MAE on the expected midpoint; QWK and within-1 accuracy on argmax) are unchanged. A natural addition is a guardrail on the top-bracket share ratio, e.g. |ratio − 1| ≤ 0.10, since the top bracket dominates euro aggregates. The selection rule is applied by hand from the exported table; it is not coded in the script.</w:t>
+      </w:r>
+    </w:p>
+    <w:p>
+      <w:pPr>
+        <w:pStyle w:val="Heading1"/>
+        <w:spacing w:after="140" w:before="280"/>
+      </w:pPr>
+      <w:r>
+        <w:rPr>
+          <w:rFonts w:ascii="Calibri" w:cs="Calibri" w:eastAsia="Calibri" w:hAnsi="Calibri"/>
+        </w:rPr>
+        <w:t xml:space="preserve">7. What has not changed</w:t>
       </w:r>
     </w:p>
     <w:p>
@@ -2459,7 +3272,7 @@
         <w:rPr>
           <w:rFonts w:ascii="Calibri" w:cs="Calibri" w:eastAsia="Calibri" w:hAnsi="Calibri"/>
         </w:rPr>
-        <w:t xml:space="preserve">Hyper-parameter grid, early stopping, final refit on all observed Q8A.</w:t>
+        <w:t xml:space="preserve">Sample construction, Q8A cleaning, predictor screening and feature set (Blocks 2–4). Open issues on these are listed in section 8.</w:t>
       </w:r>
     </w:p>
     <w:p>
@@ -2475,7 +3288,7 @@
         <w:rPr>
           <w:rFonts w:ascii="Calibri" w:cs="Calibri" w:eastAsia="Calibri" w:hAnsi="Calibri"/>
         </w:rPr>
-        <w:t xml:space="preserve">Bracket midpoints, including EUR 1.5 million for the open top bracket.</w:t>
+        <w:t xml:space="preserve">Holdout design: last 20% of observed waves (waves 26–28).</w:t>
       </w:r>
     </w:p>
     <w:p>
@@ -2491,6 +3304,38 @@
         <w:rPr>
           <w:rFonts w:ascii="Calibri" w:cs="Calibri" w:eastAsia="Calibri" w:hAnsi="Calibri"/>
         </w:rPr>
+        <w:t xml:space="preserve">Hyper-parameter grid, early stopping, final refit on all observed Q8A.</w:t>
+      </w:r>
+    </w:p>
+    <w:p>
+      <w:pPr>
+        <w:pStyle w:val="ListParagraph"/>
+        <w:numPr>
+          <w:ilvl w:val="0"/>
+          <w:numId w:val="2"/>
+        </w:numPr>
+        <w:spacing w:after="80" w:line="276"/>
+      </w:pPr>
+      <w:r>
+        <w:rPr>
+          <w:rFonts w:ascii="Calibri" w:cs="Calibri" w:eastAsia="Calibri" w:hAnsi="Calibri"/>
+        </w:rPr>
+        <w:t xml:space="preserve">Bracket midpoints, including EUR 1.5 million for the open top bracket.</w:t>
+      </w:r>
+    </w:p>
+    <w:p>
+      <w:pPr>
+        <w:pStyle w:val="ListParagraph"/>
+        <w:numPr>
+          <w:ilvl w:val="0"/>
+          <w:numId w:val="2"/>
+        </w:numPr>
+        <w:spacing w:after="80" w:line="276"/>
+      </w:pPr>
+      <w:r>
+        <w:rPr>
+          <w:rFonts w:ascii="Calibri" w:cs="Calibri" w:eastAsia="Calibri" w:hAnsi="Calibri"/>
+        </w:rPr>
         <w:t xml:space="preserve">Model II (Catboost_Model_II.R), RF_Old_Method.R and Post_Imputation_Comparison.</w:t>
       </w:r>
     </w:p>
@@ -2503,7 +3348,7 @@
         <w:rPr>
           <w:rFonts w:ascii="Calibri" w:cs="Calibri" w:eastAsia="Calibri" w:hAnsi="Calibri"/>
         </w:rPr>
-        <w:t xml:space="preserve">7. Open issues identified (not yet implemented)</w:t>
+        <w:t xml:space="preserve">8. Open issues identified (not yet implemented)</w:t>
       </w:r>
     </w:p>
     <w:p>
@@ -3191,7 +4036,7 @@
         <w:rPr>
           <w:rFonts w:ascii="Calibri" w:cs="Calibri" w:eastAsia="Calibri" w:hAnsi="Calibri"/>
         </w:rPr>
-        <w:t xml:space="preserve">8. Version history</w:t>
+        <w:t xml:space="preserve">9. Version history</w:t>
       </w:r>
     </w:p>
     <w:tbl>
@@ -3394,6 +4239,98 @@
                 <w:szCs w:val="19"/>
               </w:rPr>
               <w:t xml:space="preserve">C1 class weights, C2 expected-share TVD, C3 sector/size grouping variables (Catboost_Model_I.R).</w:t>
+            </w:r>
+          </w:p>
+        </w:tc>
+      </w:tr>
+      <w:tr>
+        <w:trPr>
+          <w:tblHeader w:val="off"/>
+        </w:trPr>
+        <w:tc>
+          <w:tcPr>
+            <w:tcW w:type="dxa" w:w="1300"/>
+            <w:tcBorders>
+              <w:top w:val="single" w:color="B7B7B7" w:sz="4"/>
+              <w:left w:val="single" w:color="B7B7B7" w:sz="4"/>
+              <w:bottom w:val="single" w:color="B7B7B7" w:sz="4"/>
+              <w:right w:val="single" w:color="B7B7B7" w:sz="4"/>
+            </w:tcBorders>
+            <w:tcMar>
+              <w:top w:type="dxa" w:w="60"/>
+              <w:left w:type="dxa" w:w="100"/>
+              <w:bottom w:type="dxa" w:w="60"/>
+              <w:right w:type="dxa" w:w="100"/>
+            </w:tcMar>
+          </w:tcPr>
+          <w:p>
+            <w:r>
+              <w:rPr>
+                <w:rFonts w:ascii="Calibri" w:cs="Calibri" w:eastAsia="Calibri" w:hAnsi="Calibri"/>
+                <w:b w:val="false"/>
+                <w:bCs w:val="false"/>
+                <w:sz w:val="19"/>
+                <w:szCs w:val="19"/>
+              </w:rPr>
+              <w:t xml:space="preserve">2</w:t>
+            </w:r>
+          </w:p>
+        </w:tc>
+        <w:tc>
+          <w:tcPr>
+            <w:tcW w:type="dxa" w:w="1700"/>
+            <w:tcBorders>
+              <w:top w:val="single" w:color="B7B7B7" w:sz="4"/>
+              <w:left w:val="single" w:color="B7B7B7" w:sz="4"/>
+              <w:bottom w:val="single" w:color="B7B7B7" w:sz="4"/>
+              <w:right w:val="single" w:color="B7B7B7" w:sz="4"/>
+            </w:tcBorders>
+            <w:tcMar>
+              <w:top w:type="dxa" w:w="60"/>
+              <w:left w:type="dxa" w:w="100"/>
+              <w:bottom w:type="dxa" w:w="60"/>
+              <w:right w:type="dxa" w:w="100"/>
+            </w:tcMar>
+          </w:tcPr>
+          <w:p>
+            <w:r>
+              <w:rPr>
+                <w:rFonts w:ascii="Calibri" w:cs="Calibri" w:eastAsia="Calibri" w:hAnsi="Calibri"/>
+                <w:b w:val="false"/>
+                <w:bCs w:val="false"/>
+                <w:sz w:val="19"/>
+                <w:szCs w:val="19"/>
+              </w:rPr>
+              <w:t xml:space="preserve">28 Oct 2026</w:t>
+            </w:r>
+          </w:p>
+        </w:tc>
+        <w:tc>
+          <w:tcPr>
+            <w:tcW w:type="dxa" w:w="6026"/>
+            <w:tcBorders>
+              <w:top w:val="single" w:color="B7B7B7" w:sz="4"/>
+              <w:left w:val="single" w:color="B7B7B7" w:sz="4"/>
+              <w:bottom w:val="single" w:color="B7B7B7" w:sz="4"/>
+              <w:right w:val="single" w:color="B7B7B7" w:sz="4"/>
+            </w:tcBorders>
+            <w:tcMar>
+              <w:top w:type="dxa" w:w="60"/>
+              <w:left w:type="dxa" w:w="100"/>
+              <w:bottom w:type="dxa" w:w="60"/>
+              <w:right w:type="dxa" w:w="100"/>
+            </w:tcMar>
+          </w:tcPr>
+          <w:p>
+            <w:r>
+              <w:rPr>
+                <w:rFonts w:ascii="Calibri" w:cs="Calibri" w:eastAsia="Calibri" w:hAnsi="Calibri"/>
+                <w:b w:val="false"/>
+                <w:bCs w:val="false"/>
+                <w:sz w:val="19"/>
+                <w:szCs w:val="19"/>
+              </w:rPr>
+              <w:t xml:space="preserve">C4 tail-risk diagnostics in expected form, top-bracket share and AUC; discussion of whether C1 meets the thesis purpose of the weights; proposed update to the §4.5 selection rule.</w:t>
             </w:r>
           </w:p>
         </w:tc>

</xml_diff>